<commit_message>
Update phase 12 documentation
</commit_message>
<xml_diff>
--- a/MASTERPLAN/Commands.docx
+++ b/MASTERPLAN/Commands.docx
@@ -3785,6 +3785,268 @@
           <w:sz w:val="18"/>
         </w:rPr>
         <w:t>sudo journalctl -u nfs-server --since "30 minutes ago" --no-pager</w:t>
+      </w:r>
+    </w:p>
+    <w:p/>
+    <w:p>
+      <w:pPr>
+        <w:pStyle w:val="Heading1"/>
+      </w:pPr>
+      <w:r>
+        <w:rPr>
+          <w:rFonts w:ascii="Arial" w:hAnsi="Arial"/>
+        </w:rPr>
+        <w:t>Phase 12.4 systemd Commands - 2026-07-07 UTC</w:t>
+      </w:r>
+    </w:p>
+    <w:p>
+      <w:r>
+        <w:rPr>
+          <w:rFonts w:ascii="Arial" w:hAnsi="Arial"/>
+          <w:sz w:val="20"/>
+        </w:rPr>
+        <w:t>sudo bash -n /opt/homelab/scripts/linux01-systemd-heartbeat.sh</w:t>
+      </w:r>
+    </w:p>
+    <w:p>
+      <w:r>
+        <w:rPr>
+          <w:rFonts w:ascii="Arial" w:hAnsi="Arial"/>
+          <w:sz w:val="20"/>
+        </w:rPr>
+        <w:t>sudo -u homelabsvc timeout 5s /opt/homelab/scripts/linux01-systemd-heartbeat.sh</w:t>
+      </w:r>
+    </w:p>
+    <w:p>
+      <w:r>
+        <w:rPr>
+          <w:rFonts w:ascii="Arial" w:hAnsi="Arial"/>
+          <w:sz w:val="20"/>
+        </w:rPr>
+        <w:t>sudo systemd-analyze verify /etc/systemd/system/linux01-systemd-heartbeat.service</w:t>
+      </w:r>
+    </w:p>
+    <w:p>
+      <w:r>
+        <w:rPr>
+          <w:rFonts w:ascii="Arial" w:hAnsi="Arial"/>
+          <w:sz w:val="20"/>
+        </w:rPr>
+        <w:t>sudo systemctl daemon-reload</w:t>
+      </w:r>
+    </w:p>
+    <w:p>
+      <w:r>
+        <w:rPr>
+          <w:rFonts w:ascii="Arial" w:hAnsi="Arial"/>
+          <w:sz w:val="20"/>
+        </w:rPr>
+        <w:t>sudo systemctl start linux01-systemd-heartbeat.service</w:t>
+      </w:r>
+    </w:p>
+    <w:p>
+      <w:r>
+        <w:rPr>
+          <w:rFonts w:ascii="Arial" w:hAnsi="Arial"/>
+          <w:sz w:val="20"/>
+        </w:rPr>
+        <w:t>sudo systemctl restart linux01-systemd-heartbeat.service</w:t>
+      </w:r>
+    </w:p>
+    <w:p>
+      <w:r>
+        <w:rPr>
+          <w:rFonts w:ascii="Arial" w:hAnsi="Arial"/>
+          <w:sz w:val="20"/>
+        </w:rPr>
+        <w:t>sudo systemctl stop linux01-systemd-heartbeat.service</w:t>
+      </w:r>
+    </w:p>
+    <w:p>
+      <w:r>
+        <w:rPr>
+          <w:rFonts w:ascii="Arial" w:hAnsi="Arial"/>
+          <w:sz w:val="20"/>
+        </w:rPr>
+        <w:t>sudo systemctl enable linux01-systemd-heartbeat.service</w:t>
+      </w:r>
+    </w:p>
+    <w:p>
+      <w:r>
+        <w:rPr>
+          <w:rFonts w:ascii="Arial" w:hAnsi="Arial"/>
+          <w:sz w:val="20"/>
+        </w:rPr>
+        <w:t>systemctl is-enabled linux01-systemd-heartbeat.service</w:t>
+      </w:r>
+    </w:p>
+    <w:p>
+      <w:r>
+        <w:rPr>
+          <w:rFonts w:ascii="Arial" w:hAnsi="Arial"/>
+          <w:sz w:val="20"/>
+        </w:rPr>
+        <w:t>systemctl is-active linux01-systemd-heartbeat.service</w:t>
+      </w:r>
+    </w:p>
+    <w:p>
+      <w:r>
+        <w:rPr>
+          <w:rFonts w:ascii="Arial" w:hAnsi="Arial"/>
+          <w:sz w:val="20"/>
+        </w:rPr>
+        <w:t>sudo journalctl -u linux01-systemd-heartbeat.service --since "10 minutes ago" --no-pager</w:t>
+      </w:r>
+    </w:p>
+    <w:p>
+      <w:r>
+        <w:rPr>
+          <w:rFonts w:ascii="Arial" w:hAnsi="Arial"/>
+          <w:sz w:val="20"/>
+        </w:rPr>
+        <w:t>sudo tail -n 10 /var/log/homelab/systemd/linux01-systemd-heartbeat.log</w:t>
+      </w:r>
+    </w:p>
+    <w:p/>
+    <w:p>
+      <w:r>
+        <w:t>CHG-2026-07-07 - Phase 12.5 SSH Key Expansion Complete</w:t>
+      </w:r>
+    </w:p>
+    <w:p>
+      <w:r>
+        <w:t>Phase 12.5 INFRA01 SSH Key Expansion Commands - Completed 2026-07-07</w:t>
+      </w:r>
+    </w:p>
+    <w:p>
+      <w:r>
+        <w:t>Test-NetConnection 192.168.1.133 -Port 22 - validated INFRA01 SSH from Windows source 192.168.1.182.</w:t>
+      </w:r>
+    </w:p>
+    <w:p>
+      <w:r>
+        <w:t>ssh michael@192.168.1.133 - validated password SSH before installing key auth.</w:t>
+      </w:r>
+    </w:p>
+    <w:p>
+      <w:r>
+        <w:t>Get-Content $env:USERPROFILE\.ssh\id_ed25519.pub | ssh michael@192.168.1.133 "mkdir -p ~/.ssh &amp;&amp; chmod 700 ~/.ssh &amp;&amp; cat &gt;&gt; ~/.ssh/authorized_keys &amp;&amp; chmod 600 ~/.ssh/authorized_keys" - installed public key only.</w:t>
+      </w:r>
+    </w:p>
+    <w:p>
+      <w:r>
+        <w:t>ssh -o BatchMode=yes michael@192.168.1.133 "hostname; whoami" - confirmed direct key auth.</w:t>
+      </w:r>
+    </w:p>
+    <w:p>
+      <w:r>
+        <w:t>ssh -G infra01 | Select-String "hostname|user|identityfile" - confirmed SSH client alias resolution.</w:t>
+      </w:r>
+    </w:p>
+    <w:p>
+      <w:r>
+        <w:t>ssh -o BatchMode=yes -o ConnectTimeout=5 infra01 "hostname; whoami" - confirmed alias key auth.</w:t>
+      </w:r>
+    </w:p>
+    <w:p>
+      <w:r>
+        <w:t>scp C:\Portfilio\infra01-ssh-key-test.txt infra01:/home/michael/infra01-ssh-key-test.txt - validated SCP transfer.</w:t>
+      </w:r>
+    </w:p>
+    <w:p>
+      <w:r>
+        <w:t>ssh infra01 "cat /home/michael/infra01-ssh-key-test.txt &amp;&amp; rm /home/michael/infra01-ssh-key-test.txt" - validated readback and cleanup.</w:t>
+      </w:r>
+    </w:p>
+    <w:p>
+      <w:r>
+        <w:t>&amp; "C:\Portfilio\IT-ENGINEER-TOOLKIT\PowerShell\Scripts\Sync-PortfolioToLinux.ps1" -Targets infra01 -NoRsync - validated safe create/update portfolio sync to INFRA01.</w:t>
+      </w:r>
+    </w:p>
+    <w:p>
+      <w:r>
+        <w:t>ssh infra01 "du -sh /home/michael/Portfolio" - confirmed INFRA01 Portfolio size after sync.</w:t>
+      </w:r>
+    </w:p>
+    <w:p/>
+    <w:p>
+      <w:r>
+        <w:t>CHG-2026-07-07 - Phase 12.6 Linux Backup And Restore Validation Complete</w:t>
+      </w:r>
+    </w:p>
+    <w:p>
+      <w:r>
+        <w:t>Phase 12.6 Linux Backup And Restore Commands - Completed 2026-07-07</w:t>
+      </w:r>
+    </w:p>
+    <w:p>
+      <w:r>
+        <w:t>BACKUP_TS=$(date -u +%Y%m%d-%H%M%S) - created UTC timestamp for archive naming.</w:t>
+      </w:r>
+    </w:p>
+    <w:p>
+      <w:r>
+        <w:t>BACKUP_DIR=/var/backups/homelab/phase12-6 - selected local backup destination.</w:t>
+      </w:r>
+    </w:p>
+    <w:p>
+      <w:r>
+        <w:t>BACKUP_FILE="$BACKUP_DIR/linux01-config-service-$BACKUP_TS.tar.gz" - named backup archive.</w:t>
+      </w:r>
+    </w:p>
+    <w:p>
+      <w:r>
+        <w:t>RESTORE_DIR=/tmp/phase12-6-restore-test - selected non-production restore test location.</w:t>
+      </w:r>
+    </w:p>
+    <w:p>
+      <w:r>
+        <w:t>sudo mkdir -p "$BACKUP_DIR" - created backup directory.</w:t>
+      </w:r>
+    </w:p>
+    <w:p>
+      <w:r>
+        <w:t>sudo chmod 700 /var/backups/homelab "$BACKUP_DIR" - restricted backup directory access.</w:t>
+      </w:r>
+    </w:p>
+    <w:p>
+      <w:r>
+        <w:t>sudo tar --xattrs --acls -czpf "$BACKUP_FILE" /etc /srv /opt/homelab /var/log/homelab - created config and service-data archive.</w:t>
+      </w:r>
+    </w:p>
+    <w:p>
+      <w:r>
+        <w:t>sudo sha256sum "$BACKUP_FILE" | sudo tee "$BACKUP_FILE.sha256" - generated checksum.</w:t>
+      </w:r>
+    </w:p>
+    <w:p>
+      <w:r>
+        <w:t>sudo tar -tzf "$BACKUP_FILE" | sudo tee "$BACKUP_FILE.manifest" &gt;/dev/null - generated manifest.</w:t>
+      </w:r>
+    </w:p>
+    <w:p>
+      <w:r>
+        <w:t>sudo tar -tzf "$BACKUP_FILE" | wc -l - counted archive entries; result was 1801.</w:t>
+      </w:r>
+    </w:p>
+    <w:p>
+      <w:r>
+        <w:t>sudo tar -xzpf "$BACKUP_FILE" -C "$RESTORE_DIR" etc/samba/smb.conf etc/exports etc/cron.d/linux01-health-report etc/systemd/system/linux01-systemd-heartbeat.service srv opt/homelab var/log/homelab - performed restore test to temp location.</w:t>
+      </w:r>
+    </w:p>
+    <w:p>
+      <w:r>
+        <w:t>sudo sha256sum -c "$BACKUP_FILE.sha256" - validated archive integrity; result was OK.</w:t>
+      </w:r>
+    </w:p>
+    <w:p>
+      <w:r>
+        <w:t>systemctl is-active ssh docker containerd smbd nfs-server cron linux01-systemd-heartbeat.service - confirmed services stayed active.</w:t>
+      </w:r>
+    </w:p>
+    <w:p>
+      <w:r>
+        <w:t>sudo rm -rf "$RESTORE_DIR" - removed temporary restore test content after validation.</w:t>
       </w:r>
     </w:p>
     <w:sectPr>

</xml_diff>